<commit_message>
feat: add mfg_cert_unit field in CHO form; fix CM warning message text based on payment status
</commit_message>
<xml_diff>
--- a/Documentos/MANUAL PACT JULIO 2026/MANUAL DE INSTRUCCIONES PACT.docx
+++ b/Documentos/MANUAL PACT JULIO 2026/MANUAL DE INSTRUCCIONES PACT.docx
@@ -20369,47 +20369,11 @@
           <w:lang w:val="es-419"/>
         </w:rPr>
       </w:pPr>
-      <w:proofErr w:type="spellStart"/>
-      <w:r>
-        <w:rPr>
-          <w:lang w:val="es-419"/>
-        </w:rPr>
-        <w:t>Funciones</w:t>
-      </w:r>
-      <w:proofErr w:type="spellEnd"/>
-      <w:r>
-        <w:rPr>
-          <w:lang w:val="es-419"/>
-        </w:rPr>
-        <w:t xml:space="preserve"> y </w:t>
-      </w:r>
-      <w:proofErr w:type="spellStart"/>
-      <w:r>
-        <w:rPr>
-          <w:lang w:val="es-419"/>
-        </w:rPr>
-        <w:t>Características</w:t>
-      </w:r>
-      <w:proofErr w:type="spellEnd"/>
-      <w:r>
-        <w:rPr>
-          <w:lang w:val="es-419"/>
-        </w:rPr>
-        <w:t xml:space="preserve"> </w:t>
-      </w:r>
-      <w:proofErr w:type="spellStart"/>
-      <w:r>
-        <w:rPr>
-          <w:lang w:val="es-419"/>
-        </w:rPr>
-        <w:t>Principales</w:t>
-      </w:r>
-      <w:proofErr w:type="spellEnd"/>
-      <w:r>
-        <w:rPr>
-          <w:lang w:val="es-419"/>
-        </w:rPr>
-        <w:t>:</w:t>
+      <w:r>
+        <w:rPr>
+          <w:lang w:val="es-419"/>
+        </w:rPr>
+        <w:t>Funciones y Características Principales:</w:t>
       </w:r>
     </w:p>
     <w:p>
@@ -20500,8 +20464,14 @@
           <w:ilvl w:val="0"/>
           <w:numId w:val="46"/>
         </w:numPr>
-      </w:pPr>
-      <w:r>
+        <w:rPr>
+          <w:lang w:val="es-419"/>
+        </w:rPr>
+      </w:pPr>
+      <w:r>
+        <w:rPr>
+          <w:lang w:val="es-419"/>
+        </w:rPr>
         <w:t xml:space="preserve">Requisito de Certificados de Manufactura (CM): </w:t>
       </w:r>
     </w:p>
@@ -20538,8 +20508,14 @@
           <w:ilvl w:val="0"/>
           <w:numId w:val="46"/>
         </w:numPr>
-      </w:pPr>
-      <w:r>
+        <w:rPr>
+          <w:lang w:val="es-419"/>
+        </w:rPr>
+      </w:pPr>
+      <w:r>
+        <w:rPr>
+          <w:lang w:val="es-419"/>
+        </w:rPr>
         <w:t xml:space="preserve">Desglose de Pagos Detallado (Ícono de Información): </w:t>
       </w:r>
     </w:p>
@@ -21080,6 +21056,835 @@
         </w:rPr>
         <w:t>* Cualquier borrado de un registro (Informe, Pago o CHO) queda registrado en el **Audit Log** del sistema, indicando qué usuario realizó la acción y en qué fecha, para garantizar la trazabilidad total del proyecto.</w:t>
       </w:r>
+    </w:p>
+    <w:p>
+      <w:pPr>
+        <w:rPr>
+          <w:lang w:val="es-419"/>
+        </w:rPr>
+      </w:pPr>
+    </w:p>
+    <w:p>
+      <w:pPr>
+        <w:rPr>
+          <w:lang w:val="es-419"/>
+        </w:rPr>
+      </w:pPr>
+    </w:p>
+    <w:p>
+      <w:pPr>
+        <w:rPr>
+          <w:lang w:val="es-419"/>
+        </w:rPr>
+      </w:pPr>
+    </w:p>
+    <w:p>
+      <w:pPr>
+        <w:pStyle w:val="Title"/>
+        <w:pBdr>
+          <w:bottom w:val="single" w:sz="8" w:space="4" w:color="156082" w:themeColor="accent1"/>
+        </w:pBdr>
+        <w:spacing w:after="300"/>
+        <w:contextualSpacing/>
+        <w:jc w:val="center"/>
+        <w:rPr>
+          <w:lang w:val="es-419"/>
+        </w:rPr>
+      </w:pPr>
+      <w:r>
+        <w:rPr>
+          <w:rFonts w:asciiTheme="majorHAnsi" w:eastAsiaTheme="majorEastAsia" w:hAnsiTheme="majorHAnsi" w:cstheme="majorBidi"/>
+          <w:color w:val="0A1D30" w:themeColor="text2" w:themeShade="BF"/>
+          <w:spacing w:val="5"/>
+          <w:kern w:val="28"/>
+          <w:sz w:val="52"/>
+          <w:szCs w:val="52"/>
+        </w:rPr>
+        <w:t xml:space="preserve">Manual de </w:t>
+      </w:r>
+      <w:proofErr w:type="spellStart"/>
+      <w:r>
+        <w:rPr>
+          <w:rFonts w:asciiTheme="majorHAnsi" w:eastAsiaTheme="majorEastAsia" w:hAnsiTheme="majorHAnsi" w:cstheme="majorBidi"/>
+          <w:color w:val="0A1D30" w:themeColor="text2" w:themeShade="BF"/>
+          <w:spacing w:val="5"/>
+          <w:kern w:val="28"/>
+          <w:sz w:val="52"/>
+          <w:szCs w:val="52"/>
+        </w:rPr>
+        <w:t>Usuario</w:t>
+      </w:r>
+      <w:proofErr w:type="spellEnd"/>
+      <w:r>
+        <w:rPr>
+          <w:rFonts w:asciiTheme="majorHAnsi" w:eastAsiaTheme="majorEastAsia" w:hAnsiTheme="majorHAnsi" w:cstheme="majorBidi"/>
+          <w:color w:val="0A1D30" w:themeColor="text2" w:themeShade="BF"/>
+          <w:spacing w:val="5"/>
+          <w:kern w:val="28"/>
+          <w:sz w:val="52"/>
+          <w:szCs w:val="52"/>
+        </w:rPr>
+        <w:t xml:space="preserve"> Paso a Paso</w:t>
+      </w:r>
+    </w:p>
+    <w:p>
+      <w:pPr>
+        <w:rPr>
+          <w:lang w:val="es-419"/>
+        </w:rPr>
+      </w:pPr>
+      <w:r>
+        <w:rPr>
+          <w:lang w:val="es-419"/>
+        </w:rPr>
+        <w:t>Esta guía está diseñada para llevarte desde la creación de un proyecto nuevo hasta la gestión de documentos, certificaciones de pago y órdenes de cambio (CHO).</w:t>
+      </w:r>
+    </w:p>
+    <w:p>
+      <w:pPr>
+        <w:rPr>
+          <w:lang w:val="es-419"/>
+        </w:rPr>
+      </w:pPr>
+    </w:p>
+    <w:p>
+      <w:pPr>
+        <w:pStyle w:val="Heading1"/>
+        <w:numPr>
+          <w:ilvl w:val="0"/>
+          <w:numId w:val="47"/>
+        </w:numPr>
+        <w:jc w:val="both"/>
+      </w:pPr>
+      <w:r>
+        <w:t xml:space="preserve">Paso 1: </w:t>
+      </w:r>
+      <w:proofErr w:type="spellStart"/>
+      <w:r>
+        <w:t>Comenzar</w:t>
+      </w:r>
+      <w:proofErr w:type="spellEnd"/>
+      <w:r>
+        <w:t xml:space="preserve"> </w:t>
+      </w:r>
+      <w:proofErr w:type="gramStart"/>
+      <w:r>
+        <w:t>un Proyecto Nuevo</w:t>
+      </w:r>
+      <w:proofErr w:type="gramEnd"/>
+    </w:p>
+    <w:p>
+      <w:pPr>
+        <w:rPr>
+          <w:lang w:val="es-419"/>
+        </w:rPr>
+      </w:pPr>
+      <w:r>
+        <w:rPr>
+          <w:lang w:val="es-419"/>
+        </w:rPr>
+        <w:t>1. Abre el programa PACT.</w:t>
+      </w:r>
+    </w:p>
+    <w:p>
+      <w:pPr>
+        <w:rPr>
+          <w:lang w:val="es-419"/>
+        </w:rPr>
+      </w:pPr>
+      <w:r>
+        <w:rPr>
+          <w:lang w:val="es-419"/>
+        </w:rPr>
+        <w:t>2. Dirígete a la sección de "Proyectos" en el menú principal.</w:t>
+      </w:r>
+    </w:p>
+    <w:p>
+      <w:pPr>
+        <w:rPr>
+          <w:lang w:val="es-419"/>
+        </w:rPr>
+      </w:pPr>
+      <w:r>
+        <w:rPr>
+          <w:lang w:val="es-419"/>
+        </w:rPr>
+        <w:t>3. Haz clic en el botón "Nuevo Proyecto".</w:t>
+      </w:r>
+    </w:p>
+    <w:p>
+      <w:pPr>
+        <w:rPr>
+          <w:lang w:val="es-419"/>
+        </w:rPr>
+      </w:pPr>
+      <w:r>
+        <w:rPr>
+          <w:lang w:val="es-419"/>
+        </w:rPr>
+        <w:t>4. Completa toda la información solicitada, como el nombre del proyecto, número de contrato, y cualquier otro dato básico.</w:t>
+      </w:r>
+    </w:p>
+    <w:p>
+      <w:pPr>
+        <w:rPr>
+          <w:lang w:val="es-419"/>
+        </w:rPr>
+      </w:pPr>
+      <w:r>
+        <w:rPr>
+          <w:lang w:val="es-419"/>
+        </w:rPr>
+        <w:t>5. Presiona "Guardar". ¡Listo! Tu proyecto ya está creado y listo para usarse.</w:t>
+      </w:r>
+    </w:p>
+    <w:p>
+      <w:pPr>
+        <w:rPr>
+          <w:lang w:val="es-419"/>
+        </w:rPr>
+      </w:pPr>
+    </w:p>
+    <w:p>
+      <w:pPr>
+        <w:rPr>
+          <w:lang w:val="es-419"/>
+        </w:rPr>
+      </w:pPr>
+    </w:p>
+    <w:p>
+      <w:pPr>
+        <w:pStyle w:val="Heading1"/>
+        <w:jc w:val="both"/>
+        <w:rPr>
+          <w:lang w:val="es-419"/>
+        </w:rPr>
+      </w:pPr>
+      <w:r>
+        <w:rPr>
+          <w:lang w:val="es-419"/>
+        </w:rPr>
+        <w:t>Paso 2: Registrar los Documentos Necesarios</w:t>
+      </w:r>
+    </w:p>
+    <w:p>
+      <w:pPr>
+        <w:rPr>
+          <w:lang w:val="es-419"/>
+        </w:rPr>
+      </w:pPr>
+    </w:p>
+    <w:p>
+      <w:pPr>
+        <w:rPr>
+          <w:lang w:val="es-419"/>
+        </w:rPr>
+      </w:pPr>
+      <w:r>
+        <w:rPr>
+          <w:lang w:val="es-419"/>
+        </w:rPr>
+        <w:t>Es muy importante mantener la documentación al día.</w:t>
+      </w:r>
+    </w:p>
+    <w:p>
+      <w:pPr>
+        <w:rPr>
+          <w:lang w:val="es-419"/>
+        </w:rPr>
+      </w:pPr>
+    </w:p>
+    <w:p>
+      <w:pPr>
+        <w:rPr>
+          <w:lang w:val="es-419"/>
+        </w:rPr>
+      </w:pPr>
+      <w:r>
+        <w:rPr>
+          <w:lang w:val="es-419"/>
+        </w:rPr>
+        <w:t>1. Entra a tu proyecto recién creado y ve a la sección de "Documentos".</w:t>
+      </w:r>
+    </w:p>
+    <w:p>
+      <w:pPr>
+        <w:rPr>
+          <w:lang w:val="es-419"/>
+        </w:rPr>
+      </w:pPr>
+      <w:r>
+        <w:rPr>
+          <w:lang w:val="es-419"/>
+        </w:rPr>
+        <w:t>2. Haz clic en "Añadir" o "Registrar Documento".</w:t>
+      </w:r>
+    </w:p>
+    <w:p>
+      <w:pPr>
+        <w:rPr>
+          <w:lang w:val="es-419"/>
+        </w:rPr>
+      </w:pPr>
+      <w:r>
+        <w:rPr>
+          <w:lang w:val="es-419"/>
+        </w:rPr>
+        <w:t>3. Sube los documentos legales o requeridos para el proyecto.</w:t>
+      </w:r>
+    </w:p>
+    <w:p>
+      <w:pPr>
+        <w:rPr>
+          <w:lang w:val="es-419"/>
+        </w:rPr>
+      </w:pPr>
+      <w:r>
+        <w:rPr>
+          <w:lang w:val="es-419"/>
+        </w:rPr>
+        <w:t>4. Verifica cuidadosamente la fecha de expiración de cada documento. Registra únicamente los documentos que no han expirado aún. El sistema puede pedirte que ingreses la fecha de vigencia.</w:t>
+      </w:r>
+    </w:p>
+    <w:p>
+      <w:r>
+        <w:t xml:space="preserve">5. Guarda </w:t>
+      </w:r>
+      <w:proofErr w:type="spellStart"/>
+      <w:r>
+        <w:t>los</w:t>
+      </w:r>
+      <w:proofErr w:type="spellEnd"/>
+      <w:r>
+        <w:t xml:space="preserve"> </w:t>
+      </w:r>
+      <w:proofErr w:type="spellStart"/>
+      <w:r>
+        <w:t>registros</w:t>
+      </w:r>
+      <w:proofErr w:type="spellEnd"/>
+      <w:r>
+        <w:t>.</w:t>
+      </w:r>
+    </w:p>
+    <w:p>
+      <w:pPr>
+        <w:rPr>
+          <w:lang w:val="es-419"/>
+        </w:rPr>
+      </w:pPr>
+    </w:p>
+    <w:p>
+      <w:pPr>
+        <w:rPr>
+          <w:lang w:val="es-419"/>
+        </w:rPr>
+      </w:pPr>
+    </w:p>
+    <w:p>
+      <w:pPr>
+        <w:pStyle w:val="Heading1"/>
+        <w:jc w:val="both"/>
+      </w:pPr>
+      <w:r>
+        <w:t xml:space="preserve">Paso 3: Registrar </w:t>
+      </w:r>
+      <w:proofErr w:type="spellStart"/>
+      <w:r>
+        <w:t>Certificados</w:t>
+      </w:r>
+      <w:proofErr w:type="spellEnd"/>
+      <w:r>
+        <w:t xml:space="preserve"> de </w:t>
+      </w:r>
+      <w:proofErr w:type="spellStart"/>
+      <w:r>
+        <w:t>Manufactura</w:t>
+      </w:r>
+      <w:proofErr w:type="spellEnd"/>
+    </w:p>
+    <w:p>
+      <w:pPr>
+        <w:rPr>
+          <w:lang w:val="es-419"/>
+        </w:rPr>
+      </w:pPr>
+    </w:p>
+    <w:p>
+      <w:pPr>
+        <w:rPr>
+          <w:lang w:val="es-419"/>
+        </w:rPr>
+      </w:pPr>
+      <w:r>
+        <w:rPr>
+          <w:lang w:val="es-419"/>
+        </w:rPr>
+        <w:t>Antes de solicitar ciertos pagos, necesitarás comprobar los materiales.</w:t>
+      </w:r>
+    </w:p>
+    <w:p>
+      <w:pPr>
+        <w:rPr>
+          <w:lang w:val="es-419"/>
+        </w:rPr>
+      </w:pPr>
+    </w:p>
+    <w:p>
+      <w:pPr>
+        <w:rPr>
+          <w:lang w:val="es-419"/>
+        </w:rPr>
+      </w:pPr>
+      <w:r>
+        <w:rPr>
+          <w:lang w:val="es-419"/>
+        </w:rPr>
+        <w:t>1. Dirígete a la sección de "Certificados" o "Manufactura".</w:t>
+      </w:r>
+    </w:p>
+    <w:p>
+      <w:pPr>
+        <w:rPr>
+          <w:lang w:val="es-419"/>
+        </w:rPr>
+      </w:pPr>
+      <w:r>
+        <w:rPr>
+          <w:lang w:val="es-419"/>
+        </w:rPr>
+        <w:t>2. Selecciona "Registrar Certificado".</w:t>
+      </w:r>
+    </w:p>
+    <w:p>
+      <w:pPr>
+        <w:rPr>
+          <w:lang w:val="es-419"/>
+        </w:rPr>
+      </w:pPr>
+      <w:r>
+        <w:rPr>
+          <w:lang w:val="es-419"/>
+        </w:rPr>
+        <w:t>3. Por cada material utilizado, ingresa los datos correspondientes y adjunta el certificado del fabricante.</w:t>
+      </w:r>
+    </w:p>
+    <w:p>
+      <w:pPr>
+        <w:rPr>
+          <w:lang w:val="es-419"/>
+        </w:rPr>
+      </w:pPr>
+      <w:r>
+        <w:rPr>
+          <w:lang w:val="es-419"/>
+        </w:rPr>
+        <w:t>4. Asegúrate de registrar todos los certificados requeridos para evitar bloqueos en tus pagos futuros.</w:t>
+      </w:r>
+    </w:p>
+    <w:p>
+      <w:pPr>
+        <w:rPr>
+          <w:lang w:val="es-419"/>
+        </w:rPr>
+      </w:pPr>
+    </w:p>
+    <w:p>
+      <w:pPr>
+        <w:rPr>
+          <w:lang w:val="es-419"/>
+        </w:rPr>
+      </w:pPr>
+    </w:p>
+    <w:p>
+      <w:pPr>
+        <w:pStyle w:val="Heading1"/>
+        <w:jc w:val="both"/>
+        <w:rPr>
+          <w:lang w:val="es-419"/>
+        </w:rPr>
+      </w:pPr>
+      <w:r>
+        <w:rPr>
+          <w:lang w:val="es-419"/>
+        </w:rPr>
+        <w:t>Paso 4: Hacer y Registrar 5 Certificaciones de Pago</w:t>
+      </w:r>
+    </w:p>
+    <w:p>
+      <w:pPr>
+        <w:rPr>
+          <w:lang w:val="es-419"/>
+        </w:rPr>
+      </w:pPr>
+    </w:p>
+    <w:p>
+      <w:pPr>
+        <w:rPr>
+          <w:lang w:val="es-419"/>
+        </w:rPr>
+      </w:pPr>
+      <w:r>
+        <w:rPr>
+          <w:lang w:val="es-419"/>
+        </w:rPr>
+        <w:t>A medida que el proyecto avanza, deberás cobrar por el trabajo realizado.</w:t>
+      </w:r>
+    </w:p>
+    <w:p>
+      <w:pPr>
+        <w:rPr>
+          <w:lang w:val="es-419"/>
+        </w:rPr>
+      </w:pPr>
+    </w:p>
+    <w:p>
+      <w:pPr>
+        <w:rPr>
+          <w:lang w:val="es-419"/>
+        </w:rPr>
+      </w:pPr>
+      <w:r>
+        <w:rPr>
+          <w:lang w:val="es-419"/>
+        </w:rPr>
+        <w:t>1. Ve a la pestaña de "Certificaciones de Pago".</w:t>
+      </w:r>
+    </w:p>
+    <w:p>
+      <w:pPr>
+        <w:rPr>
+          <w:lang w:val="es-419"/>
+        </w:rPr>
+      </w:pPr>
+      <w:r>
+        <w:rPr>
+          <w:lang w:val="es-419"/>
+        </w:rPr>
+        <w:t>2. Haz clic en "Nueva Certificación".</w:t>
+      </w:r>
+    </w:p>
+    <w:p>
+      <w:pPr>
+        <w:rPr>
+          <w:lang w:val="es-419"/>
+        </w:rPr>
+      </w:pPr>
+      <w:r>
+        <w:rPr>
+          <w:lang w:val="es-419"/>
+        </w:rPr>
+        <w:t>3. Certificación #1: Ingresa el porcentaje de avance o la cantidad trabajada en este primer periodo. Verifica que los certificados de manufactura requeridos estén en orden y guarda la certificación.</w:t>
+      </w:r>
+    </w:p>
+    <w:p>
+      <w:pPr>
+        <w:rPr>
+          <w:lang w:val="es-419"/>
+        </w:rPr>
+      </w:pPr>
+      <w:r>
+        <w:rPr>
+          <w:lang w:val="es-419"/>
+        </w:rPr>
+        <w:t xml:space="preserve">4. Certificaciones #2, #3, #4 y #5: Conforme avance el tiempo, repetirás el proceso (pasos 2 y 3) para cada una de las siguientes 4 certificaciones. </w:t>
+      </w:r>
+    </w:p>
+    <w:p>
+      <w:pPr>
+        <w:rPr>
+          <w:lang w:val="es-419"/>
+        </w:rPr>
+      </w:pPr>
+    </w:p>
+    <w:p>
+      <w:pPr>
+        <w:rPr>
+          <w:lang w:val="es-419"/>
+        </w:rPr>
+      </w:pPr>
+      <w:r>
+        <w:rPr>
+          <w:lang w:val="es-419"/>
+        </w:rPr>
+        <w:t>El programa PACT restará automáticamente lo que ya has cobrado en certificaciones anteriores para mostrarte tu balance correcto.</w:t>
+      </w:r>
+    </w:p>
+    <w:p>
+      <w:pPr>
+        <w:rPr>
+          <w:lang w:val="es-419"/>
+        </w:rPr>
+      </w:pPr>
+    </w:p>
+    <w:p>
+      <w:pPr>
+        <w:rPr>
+          <w:lang w:val="es-419"/>
+        </w:rPr>
+      </w:pPr>
+    </w:p>
+    <w:p>
+      <w:pPr>
+        <w:pStyle w:val="Heading1"/>
+        <w:jc w:val="both"/>
+        <w:rPr>
+          <w:lang w:val="es-419"/>
+        </w:rPr>
+      </w:pPr>
+      <w:r>
+        <w:rPr>
+          <w:lang w:val="es-419"/>
+        </w:rPr>
+        <w:t>Paso 5: Hacer Dos Órdenes de Cambio (CHO)</w:t>
+      </w:r>
+    </w:p>
+    <w:p>
+      <w:pPr>
+        <w:rPr>
+          <w:lang w:val="es-419"/>
+        </w:rPr>
+      </w:pPr>
+    </w:p>
+    <w:p>
+      <w:pPr>
+        <w:rPr>
+          <w:lang w:val="es-419"/>
+        </w:rPr>
+      </w:pPr>
+      <w:r>
+        <w:rPr>
+          <w:lang w:val="es-419"/>
+        </w:rPr>
+        <w:t>A veces los proyectos necesitan modificaciones (más tiempo o dinero).</w:t>
+      </w:r>
+    </w:p>
+    <w:p>
+      <w:pPr>
+        <w:rPr>
+          <w:lang w:val="es-419"/>
+        </w:rPr>
+      </w:pPr>
+    </w:p>
+    <w:p>
+      <w:pPr>
+        <w:rPr>
+          <w:lang w:val="es-419"/>
+        </w:rPr>
+      </w:pPr>
+      <w:r>
+        <w:rPr>
+          <w:lang w:val="es-419"/>
+        </w:rPr>
+        <w:t>1. Navega a la sección de "Órdenes de Cambio" (CHO).</w:t>
+      </w:r>
+    </w:p>
+    <w:p>
+      <w:pPr>
+        <w:rPr>
+          <w:lang w:val="es-419"/>
+        </w:rPr>
+      </w:pPr>
+      <w:r>
+        <w:rPr>
+          <w:lang w:val="es-419"/>
+        </w:rPr>
+        <w:t>2. Haz clic en "Nuevo CHO".</w:t>
+      </w:r>
+    </w:p>
+    <w:p>
+      <w:pPr>
+        <w:rPr>
+          <w:lang w:val="es-419"/>
+        </w:rPr>
+      </w:pPr>
+      <w:r>
+        <w:rPr>
+          <w:lang w:val="es-419"/>
+        </w:rPr>
+        <w:t>3. Primer CHO: Detalla qué cambió (por ejemplo, trabajo adicional), pon los nuevos montos y justifica el cambio. Guarda el documento.</w:t>
+      </w:r>
+    </w:p>
+    <w:p>
+      <w:pPr>
+        <w:rPr>
+          <w:lang w:val="es-419"/>
+        </w:rPr>
+      </w:pPr>
+      <w:r>
+        <w:rPr>
+          <w:lang w:val="es-419"/>
+        </w:rPr>
+        <w:t>4. Segundo CHO: Repite el proceso para registrar una segunda orden de cambio.</w:t>
+      </w:r>
+    </w:p>
+    <w:p>
+      <w:pPr>
+        <w:rPr>
+          <w:lang w:val="es-419"/>
+        </w:rPr>
+      </w:pPr>
+      <w:r>
+        <w:rPr>
+          <w:lang w:val="es-419"/>
+        </w:rPr>
+        <w:t>5. Una vez guardados y aprobados, estos CHO modificarán el monto total de tu contrato y se reflejarán en tus próximas certificaciones de pago.</w:t>
+      </w:r>
+    </w:p>
+    <w:p>
+      <w:pPr>
+        <w:rPr>
+          <w:lang w:val="es-419"/>
+        </w:rPr>
+      </w:pPr>
+    </w:p>
+    <w:p>
+      <w:pPr>
+        <w:rPr>
+          <w:lang w:val="es-419"/>
+        </w:rPr>
+      </w:pPr>
+    </w:p>
+    <w:p>
+      <w:pPr>
+        <w:pStyle w:val="Heading1"/>
+        <w:jc w:val="both"/>
+      </w:pPr>
+      <w:proofErr w:type="spellStart"/>
+      <w:r>
+        <w:t>Sección</w:t>
+      </w:r>
+      <w:proofErr w:type="spellEnd"/>
+      <w:r>
+        <w:t xml:space="preserve"> de </w:t>
+      </w:r>
+      <w:proofErr w:type="spellStart"/>
+      <w:r>
+        <w:t>Resumen</w:t>
+      </w:r>
+      <w:proofErr w:type="spellEnd"/>
+      <w:r>
+        <w:t xml:space="preserve"> (Dashboard)</w:t>
+      </w:r>
+    </w:p>
+    <w:p>
+      <w:pPr>
+        <w:rPr>
+          <w:lang w:val="es-419"/>
+        </w:rPr>
+      </w:pPr>
+    </w:p>
+    <w:p>
+      <w:pPr>
+        <w:rPr>
+          <w:lang w:val="es-419"/>
+        </w:rPr>
+      </w:pPr>
+      <w:r>
+        <w:rPr>
+          <w:lang w:val="es-419"/>
+        </w:rPr>
+        <w:t>La sección de "Resumen" te permite tener una visión general del estado actual de tu proyecto. Aquí podrás observar:</w:t>
+      </w:r>
+    </w:p>
+    <w:p>
+      <w:pPr>
+        <w:rPr>
+          <w:lang w:val="es-419"/>
+        </w:rPr>
+      </w:pPr>
+    </w:p>
+    <w:p>
+      <w:pPr>
+        <w:rPr>
+          <w:lang w:val="es-419"/>
+        </w:rPr>
+      </w:pPr>
+      <w:r>
+        <w:rPr>
+          <w:lang w:val="es-419"/>
+        </w:rPr>
+        <w:t>• El monto total del contrato original y el monto actual ajustado con los CHO aprobados.</w:t>
+      </w:r>
+    </w:p>
+    <w:p>
+      <w:pPr>
+        <w:rPr>
+          <w:lang w:val="es-419"/>
+        </w:rPr>
+      </w:pPr>
+      <w:r>
+        <w:rPr>
+          <w:lang w:val="es-419"/>
+        </w:rPr>
+        <w:t>• El total facturado hasta el momento a través de tus certificaciones de pago.</w:t>
+      </w:r>
+    </w:p>
+    <w:p>
+      <w:pPr>
+        <w:rPr>
+          <w:lang w:val="es-419"/>
+        </w:rPr>
+      </w:pPr>
+      <w:r>
+        <w:rPr>
+          <w:lang w:val="es-419"/>
+        </w:rPr>
+        <w:t>• El balance restante disponible en el contrato.</w:t>
+      </w:r>
+    </w:p>
+    <w:p>
+      <w:pPr>
+        <w:rPr>
+          <w:lang w:val="es-419"/>
+        </w:rPr>
+      </w:pPr>
+      <w:r>
+        <w:rPr>
+          <w:lang w:val="es-419"/>
+        </w:rPr>
+        <w:t>• El estado de tus documentos (cuáles están vigentes y cuáles están próximos a expirar).</w:t>
+      </w:r>
+    </w:p>
+    <w:p>
+      <w:pPr>
+        <w:rPr>
+          <w:lang w:val="es-419"/>
+        </w:rPr>
+      </w:pPr>
+      <w:r>
+        <w:rPr>
+          <w:lang w:val="es-419"/>
+        </w:rPr>
+        <w:t>• Alertas sobre certificados de manufactura pendientes.</w:t>
+      </w:r>
+    </w:p>
+    <w:p>
+      <w:pPr>
+        <w:rPr>
+          <w:lang w:val="es-419"/>
+        </w:rPr>
+      </w:pPr>
+    </w:p>
+    <w:p>
+      <w:pPr>
+        <w:rPr>
+          <w:lang w:val="es-419"/>
+        </w:rPr>
+      </w:pPr>
+      <w:r>
+        <w:rPr>
+          <w:lang w:val="es-419"/>
+        </w:rPr>
+        <w:t>Es una herramienta excelente para monitorear la salud financiera y administrativa de tu proyecto en un solo vistazo.</w:t>
+      </w:r>
+    </w:p>
+    <w:p>
+      <w:pPr>
+        <w:rPr>
+          <w:lang w:val="es-419"/>
+        </w:rPr>
+      </w:pPr>
     </w:p>
     <w:sectPr>
       <w:footerReference w:type="default" r:id="rId9"/>
@@ -25607,6 +26412,12 @@
   </w:num>
   <w:num w:numId="46" w16cid:durableId="2078940563">
     <w:abstractNumId w:val="33"/>
+  </w:num>
+  <w:num w:numId="47" w16cid:durableId="493956164">
+    <w:abstractNumId w:val="43"/>
+    <w:lvlOverride w:ilvl="0">
+      <w:startOverride w:val="1"/>
+    </w:lvlOverride>
   </w:num>
   <w:numIdMacAtCleanup w:val="46"/>
 </w:numbering>

</xml_diff>